<commit_message>
fix(exam): loai bo dia danh Tuyen Quang va Dong Yen tren tat ca mau de THCS va THPT thanh dau cham lung de giao vien tu dien
</commit_message>
<xml_diff>
--- a/public/web-tieng-anh/exams_docx/Tieng_Anh_6/Cuoi_Ky_1/CK1 - Anh 6.docx
+++ b/public/web-tieng-anh/exams_docx/Tieng_Anh_6/Cuoi_Ky_1/CK1 - Anh 6.docx
@@ -12,7 +12,7 @@
           <w:b/>
           <w:sz w:val="23"/>
         </w:rPr>
-        <w:t>UBND XÃ ĐỒNG YÊN - TRƯỜNG THCS ĐỒNG YÊN</w:t>
+        <w:t>UBND XÃ .................... - TRƯỜNG THCS ....................</w:t>
         <w:br/>
       </w:r>
       <w:r>
@@ -5608,7 +5608,7 @@
                 <w:b/>
                 <w:sz w:val="23"/>
               </w:rPr>
-              <w:t>UBND XÃ ĐỒNG YÊN</w:t>
+              <w:t>UBND XÃ ....................</w:t>
             </w:r>
           </w:p>
         </w:tc>
@@ -5657,7 +5657,7 @@
                 <w:sz w:val="23"/>
                 <w:u w:val="single"/>
               </w:rPr>
-              <w:t>TRƯỜNG THCS ĐỒNG YÊN</w:t>
+              <w:t>TRƯỜNG THCS ....................</w:t>
             </w:r>
           </w:p>
         </w:tc>
@@ -9045,7 +9045,7 @@
                 <w:b/>
                 <w:sz w:val="23"/>
               </w:rPr>
-              <w:t>UBND XÃ ĐỒNG YÊN</w:t>
+              <w:t>UBND XÃ ....................</w:t>
             </w:r>
           </w:p>
         </w:tc>
@@ -9094,7 +9094,7 @@
                 <w:sz w:val="23"/>
                 <w:u w:val="single"/>
               </w:rPr>
-              <w:t>TRƯỜNG THCS ĐỒNG YÊN</w:t>
+              <w:t>TRƯỜNG THCS ....................</w:t>
             </w:r>
           </w:p>
         </w:tc>
@@ -12444,9 +12444,9 @@
           <w:b/>
           <w:sz w:val="24"/>
         </w:rPr>
-        <w:t xml:space="preserve">        UBND XÃ ĐỒNG YÊN</w:t>
+        <w:t xml:space="preserve">        UBND XÃ ....................</w:t>
         <w:br/>
-        <w:t xml:space="preserve">    TRƯỜNG THCS ĐỒNG YÊN</w:t>
+        <w:t xml:space="preserve">    TRƯỜNG THCS ....................</w:t>
       </w:r>
     </w:p>
     <w:p>

</xml_diff>